<commit_message>
Save the S2 progress (IT-EL-5 plan, decision log, deliverables) on a side branch
</commit_message>
<xml_diff>
--- a/docs/deliverables/OJT-DTR - System Documents - Rev 1.docx
+++ b/docs/deliverables/OJT-DTR - System Documents - Rev 1.docx
@@ -1769,7 +1769,7 @@
       <w:r>
         <w:drawing>
           <wp:inline distT="0" distB="0" distL="0" distR="0">
-            <wp:extent cx="5905500" cy="2790825"/>
+            <wp:extent cx="5905500" cy="2828925"/>
             <wp:effectExtent t="0" r="0" b="0" l="0"/>
             <wp:docPr id="1" name="modmap.png" descr="modmap.png" title="modmap.png"/>
             <wp:cNvGraphicFramePr>
@@ -1794,7 +1794,7 @@
                   <pic:spPr bwMode="auto">
                     <a:xfrm>
                       <a:off x="0" y="0"/>
-                      <a:ext cx="5905500" cy="2790825"/>
+                      <a:ext cx="5905500" cy="2828925"/>
                     </a:xfrm>
                     <a:prstGeom prst="rect">
                       <a:avLst/>
@@ -5365,7 +5365,7 @@
       <w:r>
         <w:drawing>
           <wp:inline distT="0" distB="0" distL="0" distR="0">
-            <wp:extent cx="5905500" cy="3533775"/>
+            <wp:extent cx="5905500" cy="3600450"/>
             <wp:effectExtent t="0" r="0" b="0" l="0"/>
             <wp:docPr id="2" name="network.png" descr="network.png" title="network.png"/>
             <wp:cNvGraphicFramePr>
@@ -5390,7 +5390,7 @@
                   <pic:spPr bwMode="auto">
                     <a:xfrm>
                       <a:off x="0" y="0"/>
-                      <a:ext cx="5905500" cy="3533775"/>
+                      <a:ext cx="5905500" cy="3600450"/>
                     </a:xfrm>
                     <a:prstGeom prst="rect">
                       <a:avLst/>
@@ -15418,6 +15418,13 @@
     <w:p>
       <w:pPr>
         <w:spacing w:after="120"/>
+        <w:sectPr>
+          <w:footerReference w:type="default" r:id="rId6"/>
+          <w:pgSz w:w="12240" w:h="15840" w:orient="portrait"/>
+          <w:pgMar w:top="1440" w:right="1440" w:bottom="1440" w:left="1440" w:header="708" w:footer="708" w:gutter="0"/>
+          <w:pgNumType/>
+          <w:docGrid w:linePitch="360"/>
+        </w:sectPr>
       </w:pPr>
       <w:r>
         <w:rPr>
@@ -15427,17 +15434,6 @@
         </w:rPr>
         <w:t xml:space="preserve"/>
       </w:r>
-    </w:p>
-    <w:p>
-      <w:pPr>
-        <w:sectPr>
-          <w:footerReference w:type="default" r:id="rId6"/>
-          <w:pgSz w:w="12240" w:h="15840" w:orient="portrait"/>
-          <w:pgMar w:top="1440" w:right="1440" w:bottom="1440" w:left="1440" w:header="708" w:footer="708" w:gutter="0"/>
-          <w:pgNumType/>
-          <w:docGrid w:linePitch="360"/>
-        </w:sectPr>
-      </w:pPr>
     </w:p>
     <w:p>
       <w:pPr>
@@ -18036,7 +18032,7 @@
                 <w:sz w:val="18"/>
                 <w:szCs w:val="18"/>
               </w:rPr>
-              <w:t xml:space="preserve">A session open after 23:59 of its date gets the "Missing time-out" mark.</w:t>
+              <w:t xml:space="preserve">A session open 16 hours after its time-in gets the "Missing time-out" mark. A session from 22:00 to 02:00 does not get the mark (D-37).</w:t>
             </w:r>
           </w:p>
         </w:tc>
@@ -20632,7 +20628,7 @@
                 <w:sz w:val="18"/>
                 <w:szCs w:val="18"/>
               </w:rPr>
-              <w:t xml:space="preserve">Valid login gives tokens. A wrong password is rejected. Refresh gives a new pair. A used refresh token is rejected.</w:t>
+              <w:t xml:space="preserve">Valid login gives tokens. A wrong password is rejected. Refresh gives a new pair. An old used refresh token (older than the parent of the active token) is rejected after the 10-second reuse interval. The parent of the active token gives the active session (D-41).</w:t>
             </w:r>
           </w:p>
         </w:tc>
@@ -20782,7 +20778,7 @@
                 <w:sz w:val="18"/>
                 <w:szCs w:val="18"/>
               </w:rPr>
-              <w:t xml:space="preserve">An admin login from the mobile client is rejected. An OJT or facilitator login from the web client is rejected.</w:t>
+              <w:t xml:space="preserve">After an admin login in the mobile client, the client signs out at once, shows a message, and stores no data. An OJT or facilitator login in the web client gives the same result (D-38).</w:t>
             </w:r>
           </w:p>
         </w:tc>
@@ -32202,8 +32198,32 @@
         <w:szCs w:val="16"/>
       </w:rPr>
       <w:fldChar w:fldCharType="begin"/>
+    </w:r>
+    <w:r>
+      <w:rPr>
+        <w:rFonts w:ascii="Arial" w:cs="Arial" w:eastAsia="Arial" w:hAnsi="Arial"/>
+        <w:color w:val="7F7F7F"/>
+        <w:sz w:val="16"/>
+        <w:szCs w:val="16"/>
+      </w:rPr>
       <w:instrText xml:space="preserve">PAGE</w:instrText>
+    </w:r>
+    <w:r>
+      <w:rPr>
+        <w:rFonts w:ascii="Arial" w:cs="Arial" w:eastAsia="Arial" w:hAnsi="Arial"/>
+        <w:color w:val="7F7F7F"/>
+        <w:sz w:val="16"/>
+        <w:szCs w:val="16"/>
+      </w:rPr>
       <w:fldChar w:fldCharType="separate"/>
+    </w:r>
+    <w:r>
+      <w:rPr>
+        <w:rFonts w:ascii="Arial" w:cs="Arial" w:eastAsia="Arial" w:hAnsi="Arial"/>
+        <w:color w:val="7F7F7F"/>
+        <w:sz w:val="16"/>
+        <w:szCs w:val="16"/>
+      </w:rPr>
       <w:fldChar w:fldCharType="end"/>
     </w:r>
   </w:p>
@@ -32233,8 +32253,32 @@
         <w:szCs w:val="16"/>
       </w:rPr>
       <w:fldChar w:fldCharType="begin"/>
+    </w:r>
+    <w:r>
+      <w:rPr>
+        <w:rFonts w:ascii="Arial" w:cs="Arial" w:eastAsia="Arial" w:hAnsi="Arial"/>
+        <w:color w:val="7F7F7F"/>
+        <w:sz w:val="16"/>
+        <w:szCs w:val="16"/>
+      </w:rPr>
       <w:instrText xml:space="preserve">PAGE</w:instrText>
+    </w:r>
+    <w:r>
+      <w:rPr>
+        <w:rFonts w:ascii="Arial" w:cs="Arial" w:eastAsia="Arial" w:hAnsi="Arial"/>
+        <w:color w:val="7F7F7F"/>
+        <w:sz w:val="16"/>
+        <w:szCs w:val="16"/>
+      </w:rPr>
       <w:fldChar w:fldCharType="separate"/>
+    </w:r>
+    <w:r>
+      <w:rPr>
+        <w:rFonts w:ascii="Arial" w:cs="Arial" w:eastAsia="Arial" w:hAnsi="Arial"/>
+        <w:color w:val="7F7F7F"/>
+        <w:sz w:val="16"/>
+        <w:szCs w:val="16"/>
+      </w:rPr>
       <w:fldChar w:fldCharType="end"/>
     </w:r>
   </w:p>
@@ -32461,6 +32505,21 @@
     <w:name w:val="Normal"/>
     <w:qFormat/>
   </w:style>
+  <w:style w:type="table" w:styleId="TableNormal" w:default="true">
+    <w:name w:val="Normal Table"/>
+    <w:uiPriority w:val="99"/>
+    <w:semiHidden/>
+    <w:unhideWhenUsed/>
+    <w:tblPr>
+      <w:tblInd w:type="dxa" w:w="0"/>
+      <w:tblCellMar>
+        <w:top w:type="dxa" w:w="0"/>
+        <w:left w:type="dxa" w:w="108"/>
+        <w:bottom w:type="dxa" w:w="0"/>
+        <w:right w:type="dxa" w:w="108"/>
+      </w:tblCellMar>
+    </w:tblPr>
+  </w:style>
   <w:style w:type="paragraph" w:styleId="Title">
     <w:name w:val="Title"/>
     <w:basedOn w:val="Normal"/>
@@ -32525,6 +32584,139 @@
     <w:name w:val="List Paragraph"/>
     <w:basedOn w:val="Normal"/>
     <w:qFormat/>
+  </w:style>
+  <w:style w:type="paragraph" w:styleId="Caption">
+    <w:name w:val="caption"/>
+    <w:basedOn w:val="Normal"/>
+    <w:next w:val="Normal"/>
+    <w:uiPriority w:val="35"/>
+    <w:semiHidden/>
+    <w:unhideWhenUsed/>
+    <w:qFormat/>
+    <w:pPr>
+      <w:spacing w:after="200"/>
+    </w:pPr>
+    <w:rPr>
+      <w:i/>
+      <w:iCs/>
+      <w:color w:val="44546A" w:themeColor="dark2"/>
+      <w:sz w:val="18"/>
+      <w:szCs w:val="18"/>
+    </w:rPr>
+  </w:style>
+  <w:style w:type="paragraph" w:styleId="Bibliography">
+    <w:name w:val="Bibliography"/>
+    <w:basedOn w:val="Normal"/>
+    <w:next w:val="Normal"/>
+    <w:uiPriority w:val="37"/>
+    <w:unhideWhenUsed/>
+  </w:style>
+  <w:style w:type="paragraph" w:styleId="TOC1">
+    <w:name w:val="toc 1"/>
+    <w:basedOn w:val="Normal"/>
+    <w:next w:val="Normal"/>
+    <w:uiPriority w:val="39"/>
+    <w:semiHidden/>
+    <w:unhideWhenUsed/>
+    <w:pPr>
+      <w:spacing w:after="100"/>
+    </w:pPr>
+  </w:style>
+  <w:style w:type="paragraph" w:styleId="TOC2">
+    <w:name w:val="toc 2"/>
+    <w:basedOn w:val="Normal"/>
+    <w:next w:val="Normal"/>
+    <w:uiPriority w:val="39"/>
+    <w:semiHidden/>
+    <w:unhideWhenUsed/>
+    <w:pPr>
+      <w:spacing w:after="100"/>
+      <w:ind w:left="210"/>
+    </w:pPr>
+  </w:style>
+  <w:style w:type="paragraph" w:styleId="TOC3">
+    <w:name w:val="toc 3"/>
+    <w:basedOn w:val="Normal"/>
+    <w:next w:val="Normal"/>
+    <w:uiPriority w:val="39"/>
+    <w:semiHidden/>
+    <w:unhideWhenUsed/>
+    <w:pPr>
+      <w:spacing w:after="100"/>
+      <w:ind w:left="420"/>
+    </w:pPr>
+  </w:style>
+  <w:style w:type="paragraph" w:styleId="TOC4">
+    <w:name w:val="toc 4"/>
+    <w:basedOn w:val="Normal"/>
+    <w:next w:val="Normal"/>
+    <w:uiPriority w:val="39"/>
+    <w:semiHidden/>
+    <w:unhideWhenUsed/>
+    <w:pPr>
+      <w:spacing w:after="100"/>
+      <w:ind w:left="630"/>
+    </w:pPr>
+  </w:style>
+  <w:style w:type="paragraph" w:styleId="TOC5">
+    <w:name w:val="toc 5"/>
+    <w:basedOn w:val="Normal"/>
+    <w:next w:val="Normal"/>
+    <w:uiPriority w:val="39"/>
+    <w:semiHidden/>
+    <w:unhideWhenUsed/>
+    <w:pPr>
+      <w:spacing w:after="100"/>
+      <w:ind w:left="840"/>
+    </w:pPr>
+  </w:style>
+  <w:style w:type="paragraph" w:styleId="TOC6">
+    <w:name w:val="toc 6"/>
+    <w:basedOn w:val="Normal"/>
+    <w:next w:val="Normal"/>
+    <w:uiPriority w:val="39"/>
+    <w:semiHidden/>
+    <w:unhideWhenUsed/>
+    <w:pPr>
+      <w:spacing w:after="100"/>
+      <w:ind w:left="1050"/>
+    </w:pPr>
+  </w:style>
+  <w:style w:type="paragraph" w:styleId="TOC7">
+    <w:name w:val="toc 7"/>
+    <w:basedOn w:val="Normal"/>
+    <w:next w:val="Normal"/>
+    <w:uiPriority w:val="39"/>
+    <w:semiHidden/>
+    <w:unhideWhenUsed/>
+    <w:pPr>
+      <w:spacing w:after="100"/>
+      <w:ind w:left="1260"/>
+    </w:pPr>
+  </w:style>
+  <w:style w:type="paragraph" w:styleId="TOC8">
+    <w:name w:val="toc 8"/>
+    <w:basedOn w:val="Normal"/>
+    <w:next w:val="Normal"/>
+    <w:uiPriority w:val="39"/>
+    <w:semiHidden/>
+    <w:unhideWhenUsed/>
+    <w:pPr>
+      <w:spacing w:after="100"/>
+      <w:ind w:left="1470"/>
+    </w:pPr>
+  </w:style>
+  <w:style w:type="paragraph" w:styleId="TOC9">
+    <w:name w:val="toc 9"/>
+    <w:basedOn w:val="Normal"/>
+    <w:next w:val="Normal"/>
+    <w:uiPriority w:val="39"/>
+    <w:semiHidden/>
+    <w:unhideWhenUsed/>
+    <w:pPr>
+      <w:spacing w:after="100"/>
+      <w:ind w:left="1680"/>
+    </w:pPr>
   </w:style>
   <w:style w:type="character" w:styleId="Hyperlink">
     <w:name w:val="Hyperlink"/>
@@ -32609,6 +32801,13 @@
       <w:sz w:val="20"/>
       <w:szCs w:val="20"/>
     </w:rPr>
+  </w:style>
+  <w:style w:type="character" w:styleId="LineNumber">
+    <w:name w:val="line number"/>
+    <w:basedOn w:val="DefaultParagraphFont"/>
+    <w:uiPriority w:val="99"/>
+    <w:semiHidden/>
+    <w:unhideWhenUsed/>
   </w:style>
   <w:style w:type="paragraph" w:styleId="Heading1">
     <w:name w:val="Heading 1"/>

</xml_diff>